<commit_message>
Update pinned FASTA references and bilingual catalogue to v1.2.0
</commit_message>
<xml_diff>
--- a/docs/report.docx
+++ b/docs/report.docx
@@ -15,7 +15,7 @@
         <w:pStyle w:val="Normal"/>
       </w:pPr>
       <w:r>
-        <w:t xml:space="preserve">Dataset version 1.1.0 • 20 October 2026</w:t>
+        <w:t xml:space="preserve">Dataset version 1.2.0 • 27 October 2026</w:t>
       </w:r>
     </w:p>
     <w:p>
@@ -3195,7 +3195,7 @@
         </w:r>
       </w:hyperlink>
       <w:r>
-        <w:t xml:space="preserve">. Reference: fa ID 1 / GCF_000001405.39.</w:t>
+        <w:t xml:space="preserve">. Reference: fa ID 1 / GCF_000001405.40.</w:t>
       </w:r>
     </w:p>
     <w:p>
@@ -3247,7 +3247,7 @@
         </w:r>
       </w:hyperlink>
       <w:r>
-        <w:t xml:space="preserve">. Reference: fa ID 1 / GCF_000001405.39.</w:t>
+        <w:t xml:space="preserve">. Reference: fa ID 1 / GCF_000001405.40.</w:t>
       </w:r>
     </w:p>
     <w:p>
@@ -3299,7 +3299,7 @@
         </w:r>
       </w:hyperlink>
       <w:r>
-        <w:t xml:space="preserve">. Reference: fa ID 1 / GCF_000001405.39.</w:t>
+        <w:t xml:space="preserve">. Reference: fa ID 1 / GCF_000001405.40.</w:t>
       </w:r>
     </w:p>
     <w:p>
@@ -3351,7 +3351,7 @@
         </w:r>
       </w:hyperlink>
       <w:r>
-        <w:t xml:space="preserve">. Reference: fa ID 1 / GCF_000001405.39.</w:t>
+        <w:t xml:space="preserve">. Reference: fa ID 1 / GCF_000001405.40.</w:t>
       </w:r>
     </w:p>
     <w:p>
@@ -3403,7 +3403,7 @@
         </w:r>
       </w:hyperlink>
       <w:r>
-        <w:t xml:space="preserve">. Reference: fa ID 1 / GCF_000001405.39.</w:t>
+        <w:t xml:space="preserve">. Reference: fa ID 1 / GCF_000001405.40.</w:t>
       </w:r>
     </w:p>
     <w:p>
@@ -3455,7 +3455,7 @@
         </w:r>
       </w:hyperlink>
       <w:r>
-        <w:t xml:space="preserve">. Reference: fa ID 1 / GCF_000001405.39.</w:t>
+        <w:t xml:space="preserve">. Reference: fa ID 1 / GCF_000001405.40.</w:t>
       </w:r>
     </w:p>
     <w:p>
@@ -3515,7 +3515,7 @@
         </w:r>
       </w:hyperlink>
       <w:r>
-        <w:t xml:space="preserve">. Reference: fa ID 1 / GCF_000001405.39.</w:t>
+        <w:t xml:space="preserve">. Reference: fa ID 1 / GCF_000001405.40.</w:t>
       </w:r>
     </w:p>
     <w:p>
@@ -3575,7 +3575,7 @@
         </w:r>
       </w:hyperlink>
       <w:r>
-        <w:t xml:space="preserve">. Reference: fa ID 1 / GCF_000001405.39.</w:t>
+        <w:t xml:space="preserve">. Reference: fa ID 1 / GCF_000001405.40.</w:t>
       </w:r>
     </w:p>
     <w:p>
@@ -3664,7 +3664,7 @@
         </w:r>
       </w:hyperlink>
       <w:r>
-        <w:t xml:space="preserve">. Reference: fa ID 1 / GCF_000001405.39.</w:t>
+        <w:t xml:space="preserve">. Reference: fa ID 1 / GCF_000001405.40.</w:t>
       </w:r>
     </w:p>
     <w:p>
@@ -3716,7 +3716,7 @@
         </w:r>
       </w:hyperlink>
       <w:r>
-        <w:t xml:space="preserve">. Reference: fa ID 10 / GCA_902167145.1.</w:t>
+        <w:t xml:space="preserve">. Reference: fa ID 10 / GCF_902167145.1.</w:t>
       </w:r>
     </w:p>
     <w:p>
@@ -3829,7 +3829,7 @@
         </w:r>
       </w:hyperlink>
       <w:r>
-        <w:t xml:space="preserve">. Reference: fa ID 1 / GCF_000001405.39.</w:t>
+        <w:t xml:space="preserve">. Reference: fa ID 1 / GCF_000001405.40.</w:t>
       </w:r>
     </w:p>
     <w:p>
@@ -4022,7 +4022,7 @@
         </w:r>
       </w:hyperlink>
       <w:r>
-        <w:t xml:space="preserve">. Reference: fa ID 2 / GCA_000003025.6.</w:t>
+        <w:t xml:space="preserve">. Reference: fa ID 2 / GCF_054392235.1.</w:t>
       </w:r>
     </w:p>
     <w:p>
@@ -4082,7 +4082,7 @@
         </w:r>
       </w:hyperlink>
       <w:r>
-        <w:t xml:space="preserve">. Reference: fa ID 3 / GCF_000001635.24.</w:t>
+        <w:t xml:space="preserve">. Reference: fa ID 3 / GCF_000001635.27.</w:t>
       </w:r>
     </w:p>
     <w:p>
@@ -4098,7 +4098,7 @@
         <w:pStyle w:val="Normal"/>
       </w:pPr>
       <w:r>
-        <w:t xml:space="preserve">This ordinary wheat resequencing run adds a large, polyploid crop genome. Both FASTQ ends of one Thatcher sample are included. The primary study reports about 542.5 billion bases and 35× coverage for this sample; this is a real study input, not a subset made to reach a benchmark size. The proposed Renan assembly is from the same species but a different cultivar.</w:t>
+        <w:t xml:space="preserve">This ordinary wheat resequencing run adds a large, polyploid crop genome. Both FASTQ ends of one Thatcher sample are included. The primary study reports about 542.5 billion bases and 35× coverage for this sample; this is a real study input, not a subset made to reach a benchmark size. The proposed Chinese Spring assembly is from the same species but a different cultivar.</w:t>
       </w:r>
     </w:p>
     <w:p>
@@ -4134,7 +4134,7 @@
         </w:r>
       </w:hyperlink>
       <w:r>
-        <w:t xml:space="preserve">. Reference: fa ID 18 / GCA_937894285.1.</w:t>
+        <w:t xml:space="preserve">. Reference: fa ID 18 / GCF_018294505.1.</w:t>
       </w:r>
     </w:p>
     <w:p>
@@ -4227,7 +4227,7 @@
         </w:r>
       </w:hyperlink>
       <w:r>
-        <w:t xml:space="preserve">. Reference: fa ID 6 / GCA_000226075.1.</w:t>
+        <w:t xml:space="preserve">. Reference: fa ID 6 / GCF_000226075.1.</w:t>
       </w:r>
     </w:p>
     <w:p>
@@ -4356,7 +4356,7 @@
         </w:r>
       </w:hyperlink>
       <w:r>
-        <w:t xml:space="preserve">. Reference: fa ID 12 / GCA_016699485.1.</w:t>
+        <w:t xml:space="preserve">. Reference: fa ID 12 / GCF_016699485.2.</w:t>
       </w:r>
     </w:p>
     <w:p>
@@ -4408,7 +4408,7 @@
         </w:r>
       </w:hyperlink>
       <w:r>
-        <w:t xml:space="preserve">. Reference: fa ID 1 / GCF_000001405.39.</w:t>
+        <w:t xml:space="preserve">. Reference: fa ID 1 / GCF_000001405.40.</w:t>
       </w:r>
     </w:p>
     <w:p>
@@ -4580,7 +4580,7 @@
         </w:r>
       </w:hyperlink>
       <w:r>
-        <w:t xml:space="preserve">. Reference: fa ID 1 / GCF_000001405.39.</w:t>
+        <w:t xml:space="preserve">. Reference: fa ID 1 / GCF_000001405.40.</w:t>
       </w:r>
     </w:p>
     <w:p>
@@ -4684,7 +4684,7 @@
         </w:r>
       </w:hyperlink>
       <w:r>
-        <w:t xml:space="preserve">. Reference: fa ID 1 / GCF_000001405.39.</w:t>
+        <w:t xml:space="preserve">. Reference: fa ID 1 / GCF_000001405.40.</w:t>
       </w:r>
     </w:p>
     <w:p>
@@ -4753,7 +4753,7 @@
         </w:r>
       </w:hyperlink>
       <w:r>
-        <w:t xml:space="preserve">. Reference: fa ID 1 / GCF_000001405.39.</w:t>
+        <w:t xml:space="preserve">. Reference: fa ID 1 / GCF_000001405.40.</w:t>
       </w:r>
     </w:p>
     <w:p>
@@ -4805,7 +4805,7 @@
         </w:r>
       </w:hyperlink>
       <w:r>
-        <w:t xml:space="preserve">. Reference: fa ID 1 / GCF_000001405.39.</w:t>
+        <w:t xml:space="preserve">. Reference: fa ID 1 / GCF_000001405.40.</w:t>
       </w:r>
     </w:p>
     <w:p>
@@ -4857,7 +4857,7 @@
         </w:r>
       </w:hyperlink>
       <w:r>
-        <w:t xml:space="preserve">. Reference: fa ID 1 / GCF_000001405.39.</w:t>
+        <w:t xml:space="preserve">. Reference: fa ID 1 / GCF_000001405.40.</w:t>
       </w:r>
     </w:p>
     <w:p>
@@ -4917,7 +4917,7 @@
         </w:r>
       </w:hyperlink>
       <w:r>
-        <w:t xml:space="preserve">. Reference: fa ID 3 / GCF_000001635.24.</w:t>
+        <w:t xml:space="preserve">. Reference: fa ID 3 / GCF_000001635.27.</w:t>
       </w:r>
     </w:p>
     <w:p>
@@ -5143,7 +5143,7 @@
         </w:r>
       </w:hyperlink>
       <w:r>
-        <w:t xml:space="preserve">. Reference: fa ID 1 / GCF_000001405.39.</w:t>
+        <w:t xml:space="preserve">. Reference: fa ID 1 / GCF_000001405.40.</w:t>
       </w:r>
     </w:p>
     <w:p>
@@ -5321,7 +5321,7 @@
         </w:r>
       </w:hyperlink>
       <w:r>
-        <w:t xml:space="preserve">. Reference: fa ID 1 / GCF_000001405.39.</w:t>
+        <w:t xml:space="preserve">. Reference: fa ID 1 / GCF_000001405.40.</w:t>
       </w:r>
     </w:p>
     <w:p>
@@ -5381,7 +5381,7 @@
         </w:r>
       </w:hyperlink>
       <w:r>
-        <w:t xml:space="preserve">. Reference: fa ID 1 / GCF_000001405.39.</w:t>
+        <w:t xml:space="preserve">. Reference: fa ID 1 / GCF_000001405.40.</w:t>
       </w:r>
     </w:p>
     <w:p>
@@ -5433,7 +5433,7 @@
         </w:r>
       </w:hyperlink>
       <w:r>
-        <w:t xml:space="preserve">. Reference: fa ID 8 / GCA_014636035.1.</w:t>
+        <w:t xml:space="preserve">. Reference: fa ID 8 / GCF_034140825.1.</w:t>
       </w:r>
     </w:p>
     <w:p>
@@ -5485,7 +5485,7 @@
         </w:r>
       </w:hyperlink>
       <w:r>
-        <w:t xml:space="preserve">. Reference: fa ID 1 / GCF_000001405.39; fa ID 13 / GCF_000001215.4.</w:t>
+        <w:t xml:space="preserve">. Reference: fa ID 1 / GCF_000001405.40; fa ID 13 / GCF_000001215.4.</w:t>
       </w:r>
     </w:p>
     <w:p>
@@ -5597,7 +5597,7 @@
         </w:r>
       </w:hyperlink>
       <w:r>
-        <w:t xml:space="preserve">. Reference: fa ID 1 / GCF_000001405.39.</w:t>
+        <w:t xml:space="preserve">. Reference: fa ID 1 / GCF_000001405.40.</w:t>
       </w:r>
     </w:p>
     <w:p>
@@ -5649,7 +5649,7 @@
         </w:r>
       </w:hyperlink>
       <w:r>
-        <w:t xml:space="preserve">. Reference: fa ID 8 / GCA_014636035.1.</w:t>
+        <w:t xml:space="preserve">. Reference: fa ID 8 / GCF_034140825.1.</w:t>
       </w:r>
     </w:p>
     <w:p>
@@ -6550,15 +6550,15 @@
         <w:pStyle w:val="Normal"/>
       </w:pPr>
       <w:r>
-        <w:t xml:space="preserve">These 18 suggested references have fixed accession versions. They have not been downloaded or verified here. The fa sheet distinguishes source pages from proposed direct FASTA downloads. Same species does not establish the same strain, cultivar or transcript targets. A mixed community or tag library does not receive an invented single-genome reference.</w:t>
-      </w:r>
-    </w:p>
-    <w:p>
-      <w:pPr>
-        <w:pStyle w:val="Normal"/>
-      </w:pPr>
-      <w:r>
-        <w:t xml:space="preserve">fa 1: Homo sapiens — GRCh38 / </w:t>
+        <w:t xml:space="preserve">The 18 reference choices were checked against NCBI on 27 October 2026. Use the current NCBI-designated reference genome for each species, retaining the MG1655 strain for the matching E. coli input. The fixed SARS-CoV-2 reference remains NC_045512.2. A current reference can have an old release date; it is not necessarily the most recently submitted assembly. Exact versions, download links and available publisher MD5 values are listed in the fa sheet and reference table. FASTA files were not downloaded in this update. A species reference does not guarantee a match to the sample, cultivar or transcript targets. Mixed communities and tag libraries have no single genome assigned.</w:t>
+      </w:r>
+    </w:p>
+    <w:p>
+      <w:pPr>
+        <w:pStyle w:val="Normal"/>
+      </w:pPr>
+      <w:r>
+        <w:t xml:space="preserve">fa 1: Homo sapiens — GRCh38.p14 / </w:t>
       </w:r>
       <w:hyperlink r:id="rId129">
         <w:r>
@@ -6566,19 +6566,19 @@
             <w:color w:val="0563C1"/>
             <w:u w:val="single"/>
           </w:rPr>
-          <w:t xml:space="preserve">GCF_000001405.39</w:t>
-        </w:r>
-      </w:hyperlink>
-      <w:r>
-        <w:t xml:space="preserve">. Same-species proposal only; sample/strain/target/contig match and FASTA contents unverified.</w:t>
-      </w:r>
-    </w:p>
-    <w:p>
-      <w:pPr>
-        <w:pStyle w:val="Normal"/>
-      </w:pPr>
-      <w:r>
-        <w:t xml:space="preserve">fa 2: Sus scrofa — Sscrofa11.1 / </w:t>
+          <w:t xml:space="preserve">GCF_000001405.40</w:t>
+        </w:r>
+      </w:hyperlink>
+      <w:r>
+        <w:t xml:space="preserve">. Human reference genome; matching to individual donors has not been checked.</w:t>
+      </w:r>
+    </w:p>
+    <w:p>
+      <w:pPr>
+        <w:pStyle w:val="Normal"/>
+      </w:pPr>
+      <w:r>
+        <w:t xml:space="preserve">fa 2: Sus scrofa — Sscrofa_HxYL_maternal_Yorkshire_Landrace_v2.0 / </w:t>
       </w:r>
       <w:hyperlink r:id="rId130">
         <w:r>
@@ -6586,19 +6586,19 @@
             <w:color w:val="0563C1"/>
             <w:u w:val="single"/>
           </w:rPr>
-          <w:t xml:space="preserve">GCA_000003025.6</w:t>
-        </w:r>
-      </w:hyperlink>
-      <w:r>
-        <w:t xml:space="preserve">. Same-species proposal only; sample/strain/target/contig match and FASTA contents unverified.</w:t>
-      </w:r>
-    </w:p>
-    <w:p>
-      <w:pPr>
-        <w:pStyle w:val="Normal"/>
-      </w:pPr>
-      <w:r>
-        <w:t xml:space="preserve">fa 3: Mus musculus — GRCm38 / </w:t>
+          <w:t xml:space="preserve">GCF_054392235.1</w:t>
+        </w:r>
+      </w:hyperlink>
+      <w:r>
+        <w:t xml:space="preserve">. Yorkshire/Landrace pig reference; the selected FASTQ sample's breed has not been established.</w:t>
+      </w:r>
+    </w:p>
+    <w:p>
+      <w:pPr>
+        <w:pStyle w:val="Normal"/>
+      </w:pPr>
+      <w:r>
+        <w:t xml:space="preserve">fa 3: Mus musculus — GRCm39 / </w:t>
       </w:r>
       <w:hyperlink r:id="rId131">
         <w:r>
@@ -6606,19 +6606,19 @@
             <w:color w:val="0563C1"/>
             <w:u w:val="single"/>
           </w:rPr>
-          <w:t xml:space="preserve">GCF_000001635.24</w:t>
-        </w:r>
-      </w:hyperlink>
-      <w:r>
-        <w:t xml:space="preserve">. Same-species genomic reference proposal for mouse inputs; sample/strain/target match and FASTA contents unverified. For Smart-seq2, transcript/patch equivalence and auxiliary ERCC version are separately unverified.</w:t>
-      </w:r>
-    </w:p>
-    <w:p>
-      <w:pPr>
-        <w:pStyle w:val="Normal"/>
-      </w:pPr>
-      <w:r>
-        <w:t xml:space="preserve">fa 4: Escherichia coli — ASM584 / </w:t>
+          <w:t xml:space="preserve">GCF_000001635.27</w:t>
+        </w:r>
+      </w:hyperlink>
+      <w:r>
+        <w:t xml:space="preserve">. C57BL/6J mouse reference; donor substrain and transcript targets need checking. ERCC spike-ins require a separate reference.</w:t>
+      </w:r>
+    </w:p>
+    <w:p>
+      <w:pPr>
+        <w:pStyle w:val="Normal"/>
+      </w:pPr>
+      <w:r>
+        <w:t xml:space="preserve">fa 4: Escherichia coli str. K-12 substr. MG1655 — ASM584v2 / </w:t>
       </w:r>
       <w:hyperlink r:id="rId132">
         <w:r>
@@ -6630,15 +6630,15 @@
         </w:r>
       </w:hyperlink>
       <w:r>
-        <w:t xml:space="preserve">. Same-species proposal only; sample/strain/target/contig match and FASTA contents unverified.</w:t>
-      </w:r>
-    </w:p>
-    <w:p>
-      <w:pPr>
-        <w:pStyle w:val="Normal"/>
-      </w:pPr>
-      <w:r>
-        <w:t xml:space="preserve">fa 5: Mycobacterium tuberculosis — ASM19595v2 (H37Rv) / </w:t>
+        <w:t xml:space="preserve">. MG1655 reference for the MG1655 input; exact read-to-reference matching has not been measured.</w:t>
+      </w:r>
+    </w:p>
+    <w:p>
+      <w:pPr>
+        <w:pStyle w:val="Normal"/>
+      </w:pPr>
+      <w:r>
+        <w:t xml:space="preserve">fa 5: Mycobacterium tuberculosis H37Rv — ASM19595v2 / </w:t>
       </w:r>
       <w:hyperlink r:id="rId133">
         <w:r>
@@ -6650,7 +6650,7 @@
         </w:r>
       </w:hyperlink>
       <w:r>
-        <w:t xml:space="preserve">. Same-species proposal only; sample/strain/target/contig match and FASTA contents unverified.</w:t>
+        <w:t xml:space="preserve">. H37Rv reference; the selected sample's exact strain match has not been checked.</w:t>
       </w:r>
     </w:p>
     <w:p>
@@ -6666,19 +6666,19 @@
             <w:color w:val="0563C1"/>
             <w:u w:val="single"/>
           </w:rPr>
-          <w:t xml:space="preserve">GCA_000226075.1</w:t>
-        </w:r>
-      </w:hyperlink>
-      <w:r>
-        <w:t xml:space="preserve">. Same-species proposal only; sample/strain/target/contig match and FASTA contents unverified.</w:t>
-      </w:r>
-    </w:p>
-    <w:p>
-      <w:pPr>
-        <w:pStyle w:val="Normal"/>
-      </w:pPr>
-      <w:r>
-        <w:t xml:space="preserve">fa 7: Saccharomyces cerevisiae — R64 / </w:t>
+          <w:t xml:space="preserve">GCF_000226075.1</w:t>
+        </w:r>
+      </w:hyperlink>
+      <w:r>
+        <w:t xml:space="preserve">. DM 1-3 516 R44 reference for the Altus potato input; these are different cultivars.</w:t>
+      </w:r>
+    </w:p>
+    <w:p>
+      <w:pPr>
+        <w:pStyle w:val="Normal"/>
+      </w:pPr>
+      <w:r>
+        <w:t xml:space="preserve">fa 7: Saccharomyces cerevisiae S288C — R64 / </w:t>
       </w:r>
       <w:hyperlink r:id="rId135">
         <w:r>
@@ -6690,15 +6690,15 @@
         </w:r>
       </w:hyperlink>
       <w:r>
-        <w:t xml:space="preserve">. Same-species proposal only; sample/strain/target/contig match and FASTA contents unverified.</w:t>
-      </w:r>
-    </w:p>
-    <w:p>
-      <w:pPr>
-        <w:pStyle w:val="Normal"/>
-      </w:pPr>
-      <w:r>
-        <w:t xml:space="preserve">fa 8: Oryza sativa — ASM1463603v1 / </w:t>
+        <w:t xml:space="preserve">. S288C yeast reference; exact strain matching has not been checked.</w:t>
+      </w:r>
+    </w:p>
+    <w:p>
+      <w:pPr>
+        <w:pStyle w:val="Normal"/>
+      </w:pPr>
+      <w:r>
+        <w:t xml:space="preserve">fa 8: Oryza sativa Japonica Group — AGIS1.0 / </w:t>
       </w:r>
       <w:hyperlink r:id="rId136">
         <w:r>
@@ -6706,11 +6706,11 @@
             <w:color w:val="0563C1"/>
             <w:u w:val="single"/>
           </w:rPr>
-          <w:t xml:space="preserve">GCA_014636035.1</w:t>
-        </w:r>
-      </w:hyperlink>
-      <w:r>
-        <w:t xml:space="preserve">. Same-species proposal only; sample/strain/target/contig match and FASTA contents unverified.</w:t>
+          <w:t xml:space="preserve">GCF_034140825.1</w:t>
+        </w:r>
+      </w:hyperlink>
+      <w:r>
+        <w:t xml:space="preserve">. Nipponbare japonica rice reference; cultivars of the two selected rice inputs have not been confirmed.</w:t>
       </w:r>
     </w:p>
     <w:p>
@@ -6730,7 +6730,7 @@
         </w:r>
       </w:hyperlink>
       <w:r>
-        <w:t xml:space="preserve">. Same-species proposal only; sample/strain/target/contig match and FASTA contents unverified.</w:t>
+        <w:t xml:space="preserve">. Columbia Arabidopsis reference; sample and target matching has not been checked.</w:t>
       </w:r>
     </w:p>
     <w:p>
@@ -6746,11 +6746,11 @@
             <w:color w:val="0563C1"/>
             <w:u w:val="single"/>
           </w:rPr>
-          <w:t xml:space="preserve">GCA_902167145.1</w:t>
-        </w:r>
-      </w:hyperlink>
-      <w:r>
-        <w:t xml:space="preserve">. Same-species, different-inbred B73 reference for SW1611. Exact sample/cultivar/contig matching and FASTA contents remain unverified.</w:t>
+          <w:t xml:space="preserve">GCF_902167145.1</w:t>
+        </w:r>
+      </w:hyperlink>
+      <w:r>
+        <w:t xml:space="preserve">. B73 maize reference for SW1611 reads; these are different inbred lines.</w:t>
       </w:r>
     </w:p>
     <w:p>
@@ -6770,7 +6770,7 @@
         </w:r>
       </w:hyperlink>
       <w:r>
-        <w:t xml:space="preserve">. Same-species proposal only; sample/strain/target/contig match and FASTA contents unverified.</w:t>
+        <w:t xml:space="preserve">. JL-2024 whiteleg shrimp reference; exact sample matching has not been checked.</w:t>
       </w:r>
     </w:p>
     <w:p>
@@ -6786,11 +6786,11 @@
             <w:color w:val="0563C1"/>
             <w:u w:val="single"/>
           </w:rPr>
-          <w:t xml:space="preserve">GCA_016699485.1</w:t>
-        </w:r>
-      </w:hyperlink>
-      <w:r>
-        <w:t xml:space="preserve">. Same-species proposal only; sample/strain/target/contig match and FASTA contents unverified.</w:t>
+          <w:t xml:space="preserve">GCF_016699485.2</w:t>
+        </w:r>
+      </w:hyperlink>
+      <w:r>
+        <w:t xml:space="preserve">. Broiler maternal chicken reference; matching to the selected laying-hen sample has not been checked.</w:t>
       </w:r>
     </w:p>
     <w:p>
@@ -6810,7 +6810,7 @@
         </w:r>
       </w:hyperlink>
       <w:r>
-        <w:t xml:space="preserve">. Same-species proposal only; sample/strain/target/contig match and FASTA contents unverified.</w:t>
+        <w:t xml:space="preserve">. Drosophila reference; exact sample matching has not been checked.</w:t>
       </w:r>
     </w:p>
     <w:p>
@@ -6830,7 +6830,7 @@
         </w:r>
       </w:hyperlink>
       <w:r>
-        <w:t xml:space="preserve">. Same-organism label proposal; isolate/variant/target compatibility untested.</w:t>
+        <w:t xml:space="preserve">. Fixed Wuhan-Hu-1 reference; matching to the selected sample and targets has not been checked.</w:t>
       </w:r>
     </w:p>
     <w:p>
@@ -6850,7 +6850,7 @@
         </w:r>
       </w:hyperlink>
       <w:r>
-        <w:t xml:space="preserve">. Proposed same-species assembly; sample/strain/cultivar/target matching and FASTA content unverified.</w:t>
+        <w:t xml:space="preserve">. Norway spruce reference for the targeted input; exact sample and target matching has not been checked.</w:t>
       </w:r>
     </w:p>
     <w:p>
@@ -6870,7 +6870,7 @@
         </w:r>
       </w:hyperlink>
       <w:r>
-        <w:t xml:space="preserve">. Proposed same-species assembly; sample/strain/cultivar/target matching and FASTA content unverified.</w:t>
+        <w:t xml:space="preserve">. QQ74 quinoa reference; exact cultivar matching has not been checked.</w:t>
       </w:r>
     </w:p>
     <w:p>
@@ -6890,15 +6890,15 @@
         </w:r>
       </w:hyperlink>
       <w:r>
-        <w:t xml:space="preserve">. Proposed same-species assembly; sample/strain/cultivar/target matching and FASTA content unverified.</w:t>
-      </w:r>
-    </w:p>
-    <w:p>
-      <w:pPr>
-        <w:pStyle w:val="Normal"/>
-      </w:pPr>
-      <w:r>
-        <w:t xml:space="preserve">fa 18: Triticum aestivum cultivar Renan — Triticum_aestivum_Renan_v2.1 / </w:t>
+        <w:t xml:space="preserve">. 17A/GY Chinese hamster reference for the CHO input; cell-line differences have not been measured.</w:t>
+      </w:r>
+    </w:p>
+    <w:p>
+      <w:pPr>
+        <w:pStyle w:val="Normal"/>
+      </w:pPr>
+      <w:r>
+        <w:t xml:space="preserve">fa 18: Triticum aestivum — IWGSC CS RefSeq v2.1 / </w:t>
       </w:r>
       <w:hyperlink r:id="rId146">
         <w:r>
@@ -6906,19 +6906,19 @@
             <w:color w:val="0563C1"/>
             <w:u w:val="single"/>
           </w:rPr>
-          <w:t xml:space="preserve">GCA_937894285.1</w:t>
-        </w:r>
-      </w:hyperlink>
-      <w:r>
-        <w:t xml:space="preserve">. Same species, different cultivar: proposed Renan assembly for Thatcher wheat reads; exact matching is unverified.</w:t>
-      </w:r>
-    </w:p>
-    <w:p>
-      <w:pPr>
-        <w:pStyle w:val="Normal"/>
-      </w:pPr>
-      <w:r>
-        <w:t xml:space="preserve">Renan GCA_937894285.1 is a same-species, different-cultivar reference proposal for the Thatcher wheat reads. CITE tag definitions and spatial masks/coordinates may be needed for interpretation or a custom reference, but not for exact compression and recovery of the supplied FASTQ. Taxonomy tables are auxiliary files, not genomic references.</w:t>
+          <w:t xml:space="preserve">GCF_018294505.1</w:t>
+        </w:r>
+      </w:hyperlink>
+      <w:r>
+        <w:t xml:space="preserve">. Chinese Spring wheat reference for Thatcher reads; these are different cultivars.</w:t>
+      </w:r>
+    </w:p>
+    <w:p>
+      <w:pPr>
+        <w:pStyle w:val="Normal"/>
+      </w:pPr>
+      <w:r>
+        <w:t xml:space="preserve">Chinese Spring and the Thatcher wheat input are different cultivars. CITE tag definitions, spatial masks and taxonomy tables remain separate auxiliary files.</w:t>
       </w:r>
     </w:p>
     <w:p>

</xml_diff>